<commit_message>
docs(week02): ex01, ex02, ex03
</commit_message>
<xml_diff>
--- a/22655541_TranNgocHuyen.docx
+++ b/22655541_TranNgocHuyen.docx
@@ -411,6 +411,7 @@
       <w:r>
         <w:rPr>
           <w:rFonts w:ascii="Times New Roman" w:hAnsi="Times New Roman" w:cs="Times New Roman"/>
+          <w:noProof/>
           <w:sz w:val="26"/>
           <w:szCs w:val="26"/>
         </w:rPr>
@@ -475,6 +476,7 @@
       <w:r>
         <w:rPr>
           <w:rFonts w:ascii="Times New Roman" w:hAnsi="Times New Roman" w:cs="Times New Roman"/>
+          <w:noProof/>
           <w:sz w:val="26"/>
           <w:szCs w:val="26"/>
         </w:rPr>
@@ -784,63 +786,6 @@
         </w:rPr>
         <w:tab/>
       </w:r>
-      <w:r>
-        <w:rPr>
-          <w:rFonts w:ascii="Times New Roman" w:hAnsi="Times New Roman" w:cs="Times New Roman"/>
-          <w:sz w:val="26"/>
-          <w:szCs w:val="26"/>
-        </w:rPr>
-        <w:tab/>
-      </w:r>
-      <w:r>
-        <w:rPr>
-          <w:rFonts w:ascii="Times New Roman" w:hAnsi="Times New Roman" w:cs="Times New Roman"/>
-          <w:sz w:val="26"/>
-          <w:szCs w:val="26"/>
-        </w:rPr>
-        <w:tab/>
-      </w:r>
-    </w:p>
-    <w:p>
-      <w:pPr>
-        <w:rPr>
-          <w:rFonts w:ascii="Times New Roman" w:hAnsi="Times New Roman" w:cs="Times New Roman"/>
-          <w:sz w:val="26"/>
-          <w:szCs w:val="26"/>
-        </w:rPr>
-      </w:pPr>
-      <w:r>
-        <w:rPr>
-          <w:rFonts w:ascii="Times New Roman" w:hAnsi="Times New Roman" w:cs="Times New Roman"/>
-          <w:sz w:val="26"/>
-          <w:szCs w:val="26"/>
-        </w:rPr>
-        <w:tab/>
-      </w:r>
-      <w:r>
-        <w:rPr>
-          <w:rFonts w:ascii="Times New Roman" w:hAnsi="Times New Roman" w:cs="Times New Roman"/>
-          <w:sz w:val="26"/>
-          <w:szCs w:val="26"/>
-        </w:rPr>
-        <w:tab/>
-      </w:r>
-      <w:r>
-        <w:rPr>
-          <w:rFonts w:ascii="Times New Roman" w:hAnsi="Times New Roman" w:cs="Times New Roman"/>
-          <w:sz w:val="26"/>
-          <w:szCs w:val="26"/>
-        </w:rPr>
-        <w:tab/>
-      </w:r>
-      <w:r>
-        <w:rPr>
-          <w:rFonts w:ascii="Times New Roman" w:hAnsi="Times New Roman" w:cs="Times New Roman"/>
-          <w:sz w:val="26"/>
-          <w:szCs w:val="26"/>
-        </w:rPr>
-        <w:tab/>
-      </w:r>
     </w:p>
     <w:p>
       <w:pPr>
@@ -857,6 +802,197 @@
           <w:szCs w:val="26"/>
         </w:rPr>
         <w:lastRenderedPageBreak/>
+        <w:drawing>
+          <wp:inline distT="0" distB="0" distL="0" distR="0" wp14:anchorId="0486BFC1" wp14:editId="22887734">
+            <wp:extent cx="5658592" cy="3303039"/>
+            <wp:effectExtent l="0" t="0" r="0" b="0"/>
+            <wp:docPr id="823322359" name="Picture 2"/>
+            <wp:cNvGraphicFramePr>
+              <a:graphicFrameLocks xmlns:a="http://schemas.openxmlformats.org/drawingml/2006/main" noChangeAspect="1"/>
+            </wp:cNvGraphicFramePr>
+            <a:graphic xmlns:a="http://schemas.openxmlformats.org/drawingml/2006/main">
+              <a:graphicData uri="http://schemas.openxmlformats.org/drawingml/2006/picture">
+                <pic:pic xmlns:pic="http://schemas.openxmlformats.org/drawingml/2006/picture">
+                  <pic:nvPicPr>
+                    <pic:cNvPr id="0" name="Picture 6"/>
+                    <pic:cNvPicPr>
+                      <a:picLocks noChangeAspect="1" noChangeArrowheads="1"/>
+                    </pic:cNvPicPr>
+                  </pic:nvPicPr>
+                  <pic:blipFill>
+                    <a:blip r:embed="rId6" cstate="print">
+                      <a:extLst>
+                        <a:ext uri="{28A0092B-C50C-407E-A947-70E740481C1C}">
+                          <a14:useLocalDpi xmlns:a14="http://schemas.microsoft.com/office/drawing/2010/main" val="0"/>
+                        </a:ext>
+                      </a:extLst>
+                    </a:blip>
+                    <a:srcRect/>
+                    <a:stretch>
+                      <a:fillRect/>
+                    </a:stretch>
+                  </pic:blipFill>
+                  <pic:spPr bwMode="auto">
+                    <a:xfrm>
+                      <a:off x="0" y="0"/>
+                      <a:ext cx="5663477" cy="3305890"/>
+                    </a:xfrm>
+                    <a:prstGeom prst="rect">
+                      <a:avLst/>
+                    </a:prstGeom>
+                    <a:noFill/>
+                    <a:ln>
+                      <a:noFill/>
+                    </a:ln>
+                  </pic:spPr>
+                </pic:pic>
+              </a:graphicData>
+            </a:graphic>
+          </wp:inline>
+        </w:drawing>
+      </w:r>
+    </w:p>
+    <w:p>
+      <w:pPr>
+        <w:rPr>
+          <w:rFonts w:ascii="Times New Roman" w:hAnsi="Times New Roman" w:cs="Times New Roman"/>
+          <w:sz w:val="26"/>
+          <w:szCs w:val="26"/>
+        </w:rPr>
+      </w:pPr>
+      <w:r>
+        <w:rPr>
+          <w:rFonts w:ascii="Times New Roman" w:hAnsi="Times New Roman" w:cs="Times New Roman"/>
+          <w:sz w:val="26"/>
+          <w:szCs w:val="26"/>
+        </w:rPr>
+        <w:drawing>
+          <wp:inline distT="0" distB="0" distL="0" distR="0" wp14:anchorId="5F67555E" wp14:editId="0BCFED58">
+            <wp:extent cx="5943600" cy="3342005"/>
+            <wp:effectExtent l="0" t="0" r="0" b="0"/>
+            <wp:docPr id="2109318954" name="Picture 1"/>
+            <wp:cNvGraphicFramePr>
+              <a:graphicFrameLocks xmlns:a="http://schemas.openxmlformats.org/drawingml/2006/main" noChangeAspect="1"/>
+            </wp:cNvGraphicFramePr>
+            <a:graphic xmlns:a="http://schemas.openxmlformats.org/drawingml/2006/main">
+              <a:graphicData uri="http://schemas.openxmlformats.org/drawingml/2006/picture">
+                <pic:pic xmlns:pic="http://schemas.openxmlformats.org/drawingml/2006/picture">
+                  <pic:nvPicPr>
+                    <pic:cNvPr id="2109318954" name=""/>
+                    <pic:cNvPicPr/>
+                  </pic:nvPicPr>
+                  <pic:blipFill>
+                    <a:blip r:embed="rId7"/>
+                    <a:stretch>
+                      <a:fillRect/>
+                    </a:stretch>
+                  </pic:blipFill>
+                  <pic:spPr>
+                    <a:xfrm>
+                      <a:off x="0" y="0"/>
+                      <a:ext cx="5943600" cy="3342005"/>
+                    </a:xfrm>
+                    <a:prstGeom prst="rect">
+                      <a:avLst/>
+                    </a:prstGeom>
+                  </pic:spPr>
+                </pic:pic>
+              </a:graphicData>
+            </a:graphic>
+          </wp:inline>
+        </w:drawing>
+      </w:r>
+      <w:r>
+        <w:rPr>
+          <w:rFonts w:ascii="Times New Roman" w:hAnsi="Times New Roman" w:cs="Times New Roman"/>
+          <w:b/>
+          <w:bCs/>
+          <w:sz w:val="26"/>
+          <w:szCs w:val="26"/>
+        </w:rPr>
+        <w:t xml:space="preserve">Kết luận: </w:t>
+      </w:r>
+      <w:r>
+        <w:rPr>
+          <w:rFonts w:ascii="Times New Roman" w:hAnsi="Times New Roman" w:cs="Times New Roman"/>
+          <w:sz w:val="26"/>
+          <w:szCs w:val="26"/>
+        </w:rPr>
+        <w:t xml:space="preserve">Việc kết hợp State, Strategy và Decorator trong bài toán tính thuế sản phẩm giúp hệ thống linh hoạt, rõ trách nhiệm và dễ mở rộng. State quyết định ngữ cảnh áp thuế theo loại sản phẩm (thường, tiêu thụ, xa xỉ), Strategy đóng gói từng công thức thuế (VAT, thuế tiêu thụ, thuế xa xỉ), còn Decorator bổ sung các hành vi như kiểm tra dữ liệu và logging mà không sửa logic tính thuế gốc. Cách tổ chức này giúp tránh if-else lồng nhau, tăng khả năng bảo trì, tái sử dụng và bám sát các nguyên tắc thiết kế hướng đối tượng; </w:t>
+      </w:r>
+      <w:r>
+        <w:rPr>
+          <w:rFonts w:ascii="Times New Roman" w:hAnsi="Times New Roman" w:cs="Times New Roman"/>
+          <w:sz w:val="26"/>
+          <w:szCs w:val="26"/>
+        </w:rPr>
+        <w:lastRenderedPageBreak/>
+        <w:t>đổi lại, số lượng lớp sẽ nhiều hơn và người mới cần thời gian để nắm toàn bộ luồng hoạt động.</w:t>
+      </w:r>
+      <w:r>
+        <w:rPr>
+          <w:rFonts w:ascii="Times New Roman" w:hAnsi="Times New Roman" w:cs="Times New Roman"/>
+          <w:sz w:val="26"/>
+          <w:szCs w:val="26"/>
+        </w:rPr>
+        <w:tab/>
+      </w:r>
+    </w:p>
+    <w:p>
+      <w:pPr>
+        <w:rPr>
+          <w:rFonts w:ascii="Times New Roman" w:hAnsi="Times New Roman" w:cs="Times New Roman"/>
+          <w:sz w:val="26"/>
+          <w:szCs w:val="26"/>
+        </w:rPr>
+      </w:pPr>
+      <w:r>
+        <w:rPr>
+          <w:rFonts w:ascii="Times New Roman" w:hAnsi="Times New Roman" w:cs="Times New Roman"/>
+          <w:sz w:val="26"/>
+          <w:szCs w:val="26"/>
+        </w:rPr>
+        <w:tab/>
+      </w:r>
+      <w:r>
+        <w:rPr>
+          <w:rFonts w:ascii="Times New Roman" w:hAnsi="Times New Roman" w:cs="Times New Roman"/>
+          <w:sz w:val="26"/>
+          <w:szCs w:val="26"/>
+        </w:rPr>
+        <w:tab/>
+      </w:r>
+      <w:r>
+        <w:rPr>
+          <w:rFonts w:ascii="Times New Roman" w:hAnsi="Times New Roman" w:cs="Times New Roman"/>
+          <w:sz w:val="26"/>
+          <w:szCs w:val="26"/>
+        </w:rPr>
+        <w:tab/>
+      </w:r>
+      <w:r>
+        <w:rPr>
+          <w:rFonts w:ascii="Times New Roman" w:hAnsi="Times New Roman" w:cs="Times New Roman"/>
+          <w:sz w:val="26"/>
+          <w:szCs w:val="26"/>
+        </w:rPr>
+        <w:tab/>
+      </w:r>
+    </w:p>
+    <w:p>
+      <w:pPr>
+        <w:rPr>
+          <w:rFonts w:ascii="Times New Roman" w:hAnsi="Times New Roman" w:cs="Times New Roman"/>
+          <w:sz w:val="26"/>
+          <w:szCs w:val="26"/>
+        </w:rPr>
+      </w:pPr>
+      <w:r>
+        <w:rPr>
+          <w:rFonts w:ascii="Times New Roman" w:hAnsi="Times New Roman" w:cs="Times New Roman"/>
+          <w:sz w:val="26"/>
+          <w:szCs w:val="26"/>
+        </w:rPr>
         <w:t>3. Tạo một hệ thống thanh toán, nơi bạn có thể thanh toán bằng các phương thức khác nhau như Thẻ tín dụng, PayPal, và có thể thêm các phương thức thanh toán này với các tính năng bổ sung như Phí xử lý, Mã giảm giá.</w:t>
       </w:r>
       <w:r>
@@ -958,21 +1094,165 @@
         </w:rPr>
         <w:tab/>
       </w:r>
-      <w:r>
-        <w:rPr>
-          <w:rFonts w:ascii="Times New Roman" w:hAnsi="Times New Roman" w:cs="Times New Roman"/>
-          <w:sz w:val="26"/>
-          <w:szCs w:val="26"/>
-        </w:rPr>
-        <w:tab/>
-      </w:r>
-      <w:r>
-        <w:rPr>
-          <w:rFonts w:ascii="Times New Roman" w:hAnsi="Times New Roman" w:cs="Times New Roman"/>
-          <w:sz w:val="26"/>
-          <w:szCs w:val="26"/>
-        </w:rPr>
-        <w:tab/>
+    </w:p>
+    <w:p>
+      <w:pPr>
+        <w:rPr>
+          <w:rFonts w:ascii="Times New Roman" w:hAnsi="Times New Roman" w:cs="Times New Roman"/>
+          <w:sz w:val="26"/>
+          <w:szCs w:val="26"/>
+        </w:rPr>
+      </w:pPr>
+      <w:r>
+        <w:rPr>
+          <w:rFonts w:ascii="Times New Roman" w:hAnsi="Times New Roman" w:cs="Times New Roman"/>
+          <w:sz w:val="26"/>
+          <w:szCs w:val="26"/>
+        </w:rPr>
+        <w:drawing>
+          <wp:inline distT="0" distB="0" distL="0" distR="0" wp14:anchorId="33B37CDE" wp14:editId="09697E0C">
+            <wp:extent cx="4607626" cy="4411177"/>
+            <wp:effectExtent l="0" t="0" r="2540" b="8890"/>
+            <wp:docPr id="264467463" name="Picture 4"/>
+            <wp:cNvGraphicFramePr>
+              <a:graphicFrameLocks xmlns:a="http://schemas.openxmlformats.org/drawingml/2006/main" noChangeAspect="1"/>
+            </wp:cNvGraphicFramePr>
+            <a:graphic xmlns:a="http://schemas.openxmlformats.org/drawingml/2006/main">
+              <a:graphicData uri="http://schemas.openxmlformats.org/drawingml/2006/picture">
+                <pic:pic xmlns:pic="http://schemas.openxmlformats.org/drawingml/2006/picture">
+                  <pic:nvPicPr>
+                    <pic:cNvPr id="0" name="Picture 13"/>
+                    <pic:cNvPicPr>
+                      <a:picLocks noChangeAspect="1" noChangeArrowheads="1"/>
+                    </pic:cNvPicPr>
+                  </pic:nvPicPr>
+                  <pic:blipFill>
+                    <a:blip r:embed="rId8" cstate="print">
+                      <a:extLst>
+                        <a:ext uri="{28A0092B-C50C-407E-A947-70E740481C1C}">
+                          <a14:useLocalDpi xmlns:a14="http://schemas.microsoft.com/office/drawing/2010/main" val="0"/>
+                        </a:ext>
+                      </a:extLst>
+                    </a:blip>
+                    <a:srcRect/>
+                    <a:stretch>
+                      <a:fillRect/>
+                    </a:stretch>
+                  </pic:blipFill>
+                  <pic:spPr bwMode="auto">
+                    <a:xfrm>
+                      <a:off x="0" y="0"/>
+                      <a:ext cx="4618051" cy="4421157"/>
+                    </a:xfrm>
+                    <a:prstGeom prst="rect">
+                      <a:avLst/>
+                    </a:prstGeom>
+                    <a:noFill/>
+                    <a:ln>
+                      <a:noFill/>
+                    </a:ln>
+                  </pic:spPr>
+                </pic:pic>
+              </a:graphicData>
+            </a:graphic>
+          </wp:inline>
+        </w:drawing>
+      </w:r>
+    </w:p>
+    <w:p>
+      <w:pPr>
+        <w:rPr>
+          <w:rFonts w:ascii="Times New Roman" w:hAnsi="Times New Roman" w:cs="Times New Roman"/>
+          <w:sz w:val="26"/>
+          <w:szCs w:val="26"/>
+        </w:rPr>
+      </w:pPr>
+      <w:r>
+        <w:rPr>
+          <w:rFonts w:ascii="Times New Roman" w:hAnsi="Times New Roman" w:cs="Times New Roman"/>
+          <w:sz w:val="26"/>
+          <w:szCs w:val="26"/>
+        </w:rPr>
+        <w:tab/>
+      </w:r>
+    </w:p>
+    <w:p>
+      <w:pPr>
+        <w:rPr>
+          <w:rFonts w:ascii="Times New Roman" w:hAnsi="Times New Roman" w:cs="Times New Roman"/>
+          <w:sz w:val="26"/>
+          <w:szCs w:val="26"/>
+        </w:rPr>
+      </w:pPr>
+      <w:r>
+        <w:rPr>
+          <w:rFonts w:ascii="Times New Roman" w:hAnsi="Times New Roman" w:cs="Times New Roman"/>
+          <w:sz w:val="26"/>
+          <w:szCs w:val="26"/>
+        </w:rPr>
+        <w:lastRenderedPageBreak/>
+        <w:drawing>
+          <wp:inline distT="0" distB="0" distL="0" distR="0" wp14:anchorId="0BC901A4" wp14:editId="6FF439DC">
+            <wp:extent cx="5943600" cy="3342005"/>
+            <wp:effectExtent l="0" t="0" r="0" b="0"/>
+            <wp:docPr id="787151926" name="Picture 1"/>
+            <wp:cNvGraphicFramePr>
+              <a:graphicFrameLocks xmlns:a="http://schemas.openxmlformats.org/drawingml/2006/main" noChangeAspect="1"/>
+            </wp:cNvGraphicFramePr>
+            <a:graphic xmlns:a="http://schemas.openxmlformats.org/drawingml/2006/main">
+              <a:graphicData uri="http://schemas.openxmlformats.org/drawingml/2006/picture">
+                <pic:pic xmlns:pic="http://schemas.openxmlformats.org/drawingml/2006/picture">
+                  <pic:nvPicPr>
+                    <pic:cNvPr id="787151926" name=""/>
+                    <pic:cNvPicPr/>
+                  </pic:nvPicPr>
+                  <pic:blipFill>
+                    <a:blip r:embed="rId9"/>
+                    <a:stretch>
+                      <a:fillRect/>
+                    </a:stretch>
+                  </pic:blipFill>
+                  <pic:spPr>
+                    <a:xfrm>
+                      <a:off x="0" y="0"/>
+                      <a:ext cx="5943600" cy="3342005"/>
+                    </a:xfrm>
+                    <a:prstGeom prst="rect">
+                      <a:avLst/>
+                    </a:prstGeom>
+                  </pic:spPr>
+                </pic:pic>
+              </a:graphicData>
+            </a:graphic>
+          </wp:inline>
+        </w:drawing>
+      </w:r>
+    </w:p>
+    <w:p>
+      <w:pPr>
+        <w:rPr>
+          <w:rFonts w:ascii="Times New Roman" w:hAnsi="Times New Roman" w:cs="Times New Roman"/>
+          <w:sz w:val="26"/>
+          <w:szCs w:val="26"/>
+        </w:rPr>
+      </w:pPr>
+      <w:r>
+        <w:rPr>
+          <w:rFonts w:ascii="Times New Roman" w:hAnsi="Times New Roman" w:cs="Times New Roman"/>
+          <w:b/>
+          <w:bCs/>
+          <w:sz w:val="26"/>
+          <w:szCs w:val="26"/>
+        </w:rPr>
+        <w:t xml:space="preserve">Kết luận: </w:t>
+      </w:r>
+      <w:r>
+        <w:rPr>
+          <w:rFonts w:ascii="Times New Roman" w:hAnsi="Times New Roman" w:cs="Times New Roman"/>
+          <w:sz w:val="26"/>
+          <w:szCs w:val="26"/>
+        </w:rPr>
+        <w:t>Việc kết hợp State, Strategy và Decorator giúp hệ thống thanh toán linh hoạt và dễ mở rộng. State chịu trách nhiệm chọn ngữ cảnh thanh toán (Thẻ tín dụng/PayPal), Strategy xử lý logic cốt lõi của từng phương thức, còn Decorator cho phép bổ sung các chức năng như phí xử lý và mã giảm giá mà không làm thay đổi code gốc. Nhờ đó hệ thống giảm phụ thuộc vào if-else phức tạp, tăng khả năng bảo trì và tái sử dụng; tuy nhiên số lượng lớp tăng lên và cấu trúc sẽ cần thời gian để người mới làm quen.</w:t>
       </w:r>
     </w:p>
     <w:sectPr>

</xml_diff>

<commit_message>
feat(ex01): create dockerfile in nodejs
</commit_message>
<xml_diff>
--- a/22655541_TranNgocHuyen.docx
+++ b/22655541_TranNgocHuyen.docx
@@ -48,20 +48,17 @@
         </w:numPr>
       </w:pPr>
       <w:r>
-        <w:t xml:space="preserve">docker </w:t>
-      </w:r>
-      <w:r>
-        <w:t>–</w:t>
-      </w:r>
-      <w:r>
-        <w:t>version</w:t>
-      </w:r>
-    </w:p>
-    <w:p>
-      <w:pPr>
-        <w:pStyle w:val="ListParagraph"/>
-      </w:pPr>
-      <w:r>
+        <w:t>docker –version</w:t>
+      </w:r>
+    </w:p>
+    <w:p>
+      <w:pPr>
+        <w:pStyle w:val="ListParagraph"/>
+      </w:pPr>
+      <w:r>
+        <w:rPr>
+          <w:noProof/>
+        </w:rPr>
         <w:drawing>
           <wp:inline distT="0" distB="0" distL="0" distR="0" wp14:anchorId="33C1EA8D" wp14:editId="314FF2F3">
             <wp:extent cx="3572374" cy="485843"/>
@@ -116,6 +113,9 @@
         <w:pStyle w:val="ListParagraph"/>
       </w:pPr>
       <w:r>
+        <w:rPr>
+          <w:noProof/>
+        </w:rPr>
         <w:drawing>
           <wp:inline distT="0" distB="0" distL="0" distR="0" wp14:anchorId="7C2D76C3" wp14:editId="4ED9D75A">
             <wp:extent cx="5943600" cy="2325370"/>
@@ -170,6 +170,9 @@
         <w:pStyle w:val="ListParagraph"/>
       </w:pPr>
       <w:r>
+        <w:rPr>
+          <w:noProof/>
+        </w:rPr>
         <w:drawing>
           <wp:inline distT="0" distB="0" distL="0" distR="0" wp14:anchorId="4B4F04C0" wp14:editId="1F739455">
             <wp:extent cx="5943600" cy="3285490"/>
@@ -224,6 +227,9 @@
         <w:pStyle w:val="ListParagraph"/>
       </w:pPr>
       <w:r>
+        <w:rPr>
+          <w:noProof/>
+        </w:rPr>
         <w:lastRenderedPageBreak/>
         <w:drawing>
           <wp:inline distT="0" distB="0" distL="0" distR="0" wp14:anchorId="069D373A" wp14:editId="00E66AEB">
@@ -279,6 +285,9 @@
         <w:pStyle w:val="ListParagraph"/>
       </w:pPr>
       <w:r>
+        <w:rPr>
+          <w:noProof/>
+        </w:rPr>
         <w:drawing>
           <wp:inline distT="0" distB="0" distL="0" distR="0" wp14:anchorId="59E7C4DD" wp14:editId="3868AB39">
             <wp:extent cx="5943600" cy="851535"/>
@@ -333,6 +342,9 @@
         <w:pStyle w:val="ListParagraph"/>
       </w:pPr>
       <w:r>
+        <w:rPr>
+          <w:noProof/>
+        </w:rPr>
         <w:drawing>
           <wp:inline distT="0" distB="0" distL="0" distR="0" wp14:anchorId="5F52D659" wp14:editId="0E229E3E">
             <wp:extent cx="5943600" cy="495935"/>
@@ -387,6 +399,9 @@
         <w:pStyle w:val="ListParagraph"/>
       </w:pPr>
       <w:r>
+        <w:rPr>
+          <w:noProof/>
+        </w:rPr>
         <w:drawing>
           <wp:inline distT="0" distB="0" distL="0" distR="0" wp14:anchorId="1AA2C4BC" wp14:editId="5726B4A4">
             <wp:extent cx="5943600" cy="1084580"/>
@@ -441,6 +456,9 @@
         <w:pStyle w:val="ListParagraph"/>
       </w:pPr>
       <w:r>
+        <w:rPr>
+          <w:noProof/>
+        </w:rPr>
         <w:drawing>
           <wp:inline distT="0" distB="0" distL="0" distR="0" wp14:anchorId="5ABBF9EC" wp14:editId="1928F3EC">
             <wp:extent cx="5943600" cy="939165"/>
@@ -495,6 +513,9 @@
         <w:pStyle w:val="ListParagraph"/>
       </w:pPr>
       <w:r>
+        <w:rPr>
+          <w:noProof/>
+        </w:rPr>
         <w:drawing>
           <wp:inline distT="0" distB="0" distL="0" distR="0" wp14:anchorId="0E2C78E2" wp14:editId="5B26344A">
             <wp:extent cx="4801270" cy="628738"/>
@@ -549,6 +570,9 @@
         <w:pStyle w:val="ListParagraph"/>
       </w:pPr>
       <w:r>
+        <w:rPr>
+          <w:noProof/>
+        </w:rPr>
         <w:drawing>
           <wp:inline distT="0" distB="0" distL="0" distR="0" wp14:anchorId="23E938FA" wp14:editId="335A4FB3">
             <wp:extent cx="5943600" cy="1026160"/>
@@ -603,6 +627,9 @@
         <w:pStyle w:val="ListParagraph"/>
       </w:pPr>
       <w:r>
+        <w:rPr>
+          <w:noProof/>
+        </w:rPr>
         <w:lastRenderedPageBreak/>
         <w:drawing>
           <wp:inline distT="0" distB="0" distL="0" distR="0" wp14:anchorId="352DE693" wp14:editId="336356DF">
@@ -658,6 +685,9 @@
         <w:pStyle w:val="ListParagraph"/>
       </w:pPr>
       <w:r>
+        <w:rPr>
+          <w:noProof/>
+        </w:rPr>
         <w:drawing>
           <wp:inline distT="0" distB="0" distL="0" distR="0" wp14:anchorId="0FDBB408" wp14:editId="6CEB6F7F">
             <wp:extent cx="5943600" cy="1224915"/>
@@ -712,6 +742,9 @@
         <w:pStyle w:val="ListParagraph"/>
       </w:pPr>
       <w:r>
+        <w:rPr>
+          <w:noProof/>
+        </w:rPr>
         <w:drawing>
           <wp:inline distT="0" distB="0" distL="0" distR="0" wp14:anchorId="60103202" wp14:editId="61C7374E">
             <wp:extent cx="5943600" cy="1495425"/>
@@ -766,6 +799,9 @@
         <w:pStyle w:val="ListParagraph"/>
       </w:pPr>
       <w:r>
+        <w:rPr>
+          <w:noProof/>
+        </w:rPr>
         <w:drawing>
           <wp:inline distT="0" distB="0" distL="0" distR="0" wp14:anchorId="473E17ED" wp14:editId="3C6BF68F">
             <wp:extent cx="5943600" cy="484505"/>
@@ -820,6 +856,9 @@
         <w:pStyle w:val="ListParagraph"/>
       </w:pPr>
       <w:r>
+        <w:rPr>
+          <w:noProof/>
+        </w:rPr>
         <w:drawing>
           <wp:inline distT="0" distB="0" distL="0" distR="0" wp14:anchorId="650F7B71" wp14:editId="43078F99">
             <wp:extent cx="5943600" cy="2308860"/>
@@ -874,6 +913,9 @@
         <w:pStyle w:val="ListParagraph"/>
       </w:pPr>
       <w:r>
+        <w:rPr>
+          <w:noProof/>
+        </w:rPr>
         <w:lastRenderedPageBreak/>
         <w:drawing>
           <wp:inline distT="0" distB="0" distL="0" distR="0" wp14:anchorId="13A5F8AA" wp14:editId="6A2FBF99">
@@ -929,6 +971,9 @@
         <w:pStyle w:val="ListParagraph"/>
       </w:pPr>
       <w:r>
+        <w:rPr>
+          <w:noProof/>
+        </w:rPr>
         <w:drawing>
           <wp:inline distT="0" distB="0" distL="0" distR="0" wp14:anchorId="4C4D349D" wp14:editId="5F4237E7">
             <wp:extent cx="5943600" cy="2933700"/>
@@ -983,6 +1028,9 @@
         <w:pStyle w:val="ListParagraph"/>
       </w:pPr>
       <w:r>
+        <w:rPr>
+          <w:noProof/>
+        </w:rPr>
         <w:drawing>
           <wp:inline distT="0" distB="0" distL="0" distR="0" wp14:anchorId="2D4480D0" wp14:editId="67BCB814">
             <wp:extent cx="5943600" cy="455930"/>
@@ -1037,6 +1085,9 @@
         <w:pStyle w:val="ListParagraph"/>
       </w:pPr>
       <w:r>
+        <w:rPr>
+          <w:noProof/>
+        </w:rPr>
         <w:lastRenderedPageBreak/>
         <w:drawing>
           <wp:inline distT="0" distB="0" distL="0" distR="0" wp14:anchorId="41763366" wp14:editId="6E9EA76B">
@@ -1092,6 +1143,9 @@
         <w:pStyle w:val="ListParagraph"/>
       </w:pPr>
       <w:r>
+        <w:rPr>
+          <w:noProof/>
+        </w:rPr>
         <w:drawing>
           <wp:inline distT="0" distB="0" distL="0" distR="0" wp14:anchorId="5784CBCF" wp14:editId="3096E671">
             <wp:extent cx="5943600" cy="1985645"/>
@@ -1146,6 +1200,9 @@
         <w:pStyle w:val="ListParagraph"/>
       </w:pPr>
       <w:r>
+        <w:rPr>
+          <w:noProof/>
+        </w:rPr>
         <w:drawing>
           <wp:inline distT="0" distB="0" distL="0" distR="0" wp14:anchorId="5E678FAA" wp14:editId="775833DB">
             <wp:extent cx="5943600" cy="377825"/>
@@ -1200,6 +1257,9 @@
         <w:pStyle w:val="ListParagraph"/>
       </w:pPr>
       <w:r>
+        <w:rPr>
+          <w:noProof/>
+        </w:rPr>
         <w:drawing>
           <wp:inline distT="0" distB="0" distL="0" distR="0" wp14:anchorId="56889178" wp14:editId="2445FB29">
             <wp:extent cx="5943600" cy="2169795"/>
@@ -1254,6 +1314,9 @@
         <w:pStyle w:val="ListParagraph"/>
       </w:pPr>
       <w:r>
+        <w:rPr>
+          <w:noProof/>
+        </w:rPr>
         <w:lastRenderedPageBreak/>
         <w:drawing>
           <wp:inline distT="0" distB="0" distL="0" distR="0" wp14:anchorId="7EC0D85C" wp14:editId="473946CB">
@@ -1309,6 +1372,9 @@
         <w:pStyle w:val="ListParagraph"/>
       </w:pPr>
       <w:r>
+        <w:rPr>
+          <w:noProof/>
+        </w:rPr>
         <w:drawing>
           <wp:inline distT="0" distB="0" distL="0" distR="0" wp14:anchorId="4B2A3EC1" wp14:editId="2EB63D6B">
             <wp:extent cx="5839640" cy="523948"/>
@@ -1355,14 +1421,25 @@
         </w:numPr>
       </w:pPr>
       <w:r>
-        <w:t>docker run -d --network my_network --name my_container nginx</w:t>
-      </w:r>
-    </w:p>
-    <w:p>
-      <w:pPr>
-        <w:pStyle w:val="ListParagraph"/>
-      </w:pPr>
-      <w:r>
+        <w:t xml:space="preserve">docker </w:t>
+      </w:r>
+      <w:proofErr w:type="gramStart"/>
+      <w:r>
+        <w:t>run -d --</w:t>
+      </w:r>
+      <w:proofErr w:type="gramEnd"/>
+      <w:r>
+        <w:t>network my_network --name my_container nginx</w:t>
+      </w:r>
+    </w:p>
+    <w:p>
+      <w:pPr>
+        <w:pStyle w:val="ListParagraph"/>
+      </w:pPr>
+      <w:r>
+        <w:rPr>
+          <w:noProof/>
+        </w:rPr>
         <w:drawing>
           <wp:inline distT="0" distB="0" distL="0" distR="0" wp14:anchorId="74F5E540" wp14:editId="1A275255">
             <wp:extent cx="5943600" cy="466090"/>
@@ -1417,6 +1494,9 @@
         <w:pStyle w:val="ListParagraph"/>
       </w:pPr>
       <w:r>
+        <w:rPr>
+          <w:noProof/>
+        </w:rPr>
         <w:drawing>
           <wp:inline distT="0" distB="0" distL="0" distR="0" wp14:anchorId="2BCFEACB" wp14:editId="626F3500">
             <wp:extent cx="5020376" cy="571580"/>
@@ -1471,6 +1551,9 @@
         <w:pStyle w:val="ListParagraph"/>
       </w:pPr>
       <w:r>
+        <w:rPr>
+          <w:noProof/>
+        </w:rPr>
         <w:drawing>
           <wp:inline distT="0" distB="0" distL="0" distR="0" wp14:anchorId="2018CB58" wp14:editId="723DBEC4">
             <wp:extent cx="5658640" cy="533474"/>
@@ -1525,6 +1608,9 @@
         <w:pStyle w:val="ListParagraph"/>
       </w:pPr>
       <w:r>
+        <w:rPr>
+          <w:noProof/>
+        </w:rPr>
         <w:drawing>
           <wp:inline distT="0" distB="0" distL="0" distR="0" wp14:anchorId="5DCE8E62" wp14:editId="7F940018">
             <wp:extent cx="5943600" cy="1710690"/>
@@ -1595,8 +1681,13 @@
         </w:numPr>
       </w:pPr>
       <w:r>
-        <w:t>docker build -t my_nginx_image .</w:t>
-      </w:r>
+        <w:t>docker build -t my_nginx_</w:t>
+      </w:r>
+      <w:proofErr w:type="gramStart"/>
+      <w:r>
+        <w:t>image .</w:t>
+      </w:r>
+      <w:proofErr w:type="gramEnd"/>
     </w:p>
     <w:p>
       <w:pPr>
@@ -1673,7 +1764,41 @@
         <w:tab/>
       </w:r>
       <w:r>
-        <w:tab/>
+        <w:drawing>
+          <wp:inline distT="0" distB="0" distL="0" distR="0" wp14:anchorId="1276B96D" wp14:editId="2F631861">
+            <wp:extent cx="5943600" cy="3342005"/>
+            <wp:effectExtent l="0" t="0" r="0" b="0"/>
+            <wp:docPr id="1763320606" name="Picture 1"/>
+            <wp:cNvGraphicFramePr>
+              <a:graphicFrameLocks xmlns:a="http://schemas.openxmlformats.org/drawingml/2006/main" noChangeAspect="1"/>
+            </wp:cNvGraphicFramePr>
+            <a:graphic xmlns:a="http://schemas.openxmlformats.org/drawingml/2006/main">
+              <a:graphicData uri="http://schemas.openxmlformats.org/drawingml/2006/picture">
+                <pic:pic xmlns:pic="http://schemas.openxmlformats.org/drawingml/2006/picture">
+                  <pic:nvPicPr>
+                    <pic:cNvPr id="1763320606" name=""/>
+                    <pic:cNvPicPr/>
+                  </pic:nvPicPr>
+                  <pic:blipFill>
+                    <a:blip r:embed="rId33"/>
+                    <a:stretch>
+                      <a:fillRect/>
+                    </a:stretch>
+                  </pic:blipFill>
+                  <pic:spPr>
+                    <a:xfrm>
+                      <a:off x="0" y="0"/>
+                      <a:ext cx="5943600" cy="3342005"/>
+                    </a:xfrm>
+                    <a:prstGeom prst="rect">
+                      <a:avLst/>
+                    </a:prstGeom>
+                  </pic:spPr>
+                </pic:pic>
+              </a:graphicData>
+            </a:graphic>
+          </wp:inline>
+        </w:drawing>
       </w:r>
     </w:p>
     <w:p>
@@ -1753,6 +1878,7 @@
     </w:p>
     <w:p>
       <w:r>
+        <w:lastRenderedPageBreak/>
         <w:tab/>
         <w:t>Sử dụng node:18-alpine làm base image.</w:t>
       </w:r>
@@ -1791,7 +1917,15 @@
     <w:p>
       <w:r>
         <w:tab/>
-        <w:t>Tạo một file index.html đơn giản và sử dụng nginx:latest để phục vụ trang web.</w:t>
+        <w:t xml:space="preserve">Tạo một file index.html đơn giản và sử dụng </w:t>
+      </w:r>
+      <w:proofErr w:type="gramStart"/>
+      <w:r>
+        <w:t>nginx:latest</w:t>
+      </w:r>
+      <w:proofErr w:type="gramEnd"/>
+      <w:r>
+        <w:t xml:space="preserve"> để phục vụ trang web.</w:t>
       </w:r>
       <w:r>
         <w:tab/>
@@ -1855,43 +1989,135 @@
     </w:p>
     <w:p>
       <w:r>
+        <w:tab/>
+        <w:t>Viết Dockerfile để build một ứng dụng Node.js với hai stage:</w:t>
+      </w:r>
+      <w:r>
+        <w:tab/>
+      </w:r>
+    </w:p>
+    <w:p>
+      <w:r>
+        <w:tab/>
+        <w:t>Stage 1: Dùng node:18 để build code.</w:t>
+      </w:r>
+      <w:r>
+        <w:tab/>
+      </w:r>
+    </w:p>
+    <w:p>
+      <w:r>
+        <w:tab/>
+        <w:t>Stage 2: Dùng node:18-alpine để chạy ứng dụng đã build.</w:t>
+      </w:r>
+      <w:r>
+        <w:tab/>
+      </w:r>
+    </w:p>
+    <w:p>
+      <w:r>
+        <w:tab/>
+      </w:r>
+      <w:r>
+        <w:tab/>
+      </w:r>
+    </w:p>
+    <w:p>
+      <w:r>
+        <w:t>Bài 7: Sử dụng biến môi trường trong Dockerfile</w:t>
+      </w:r>
+      <w:r>
+        <w:tab/>
+      </w:r>
+      <w:r>
+        <w:tab/>
+      </w:r>
+    </w:p>
+    <w:p>
+      <w:r>
+        <w:tab/>
+        <w:t>Yêu cầu:</w:t>
+      </w:r>
+      <w:r>
+        <w:tab/>
+      </w:r>
+    </w:p>
+    <w:p>
+      <w:r>
+        <w:tab/>
+        <w:t>Viết Dockerfile cho ứng dụng Python đọc biến môi trường APP_ENV và in ra màn hình.</w:t>
+      </w:r>
+      <w:r>
+        <w:tab/>
+      </w:r>
+    </w:p>
+    <w:p>
+      <w:r>
+        <w:tab/>
+        <w:t>Sử dụng ENV APP_ENV=development trong Dockerfile.</w:t>
+      </w:r>
+      <w:r>
+        <w:tab/>
+      </w:r>
+    </w:p>
+    <w:p>
+      <w:r>
+        <w:tab/>
+      </w:r>
+      <w:r>
+        <w:tab/>
+      </w:r>
+    </w:p>
+    <w:p>
+      <w:r>
+        <w:t>Bài 8: Tạo Dockerfile cho PostgreSQL tùy chỉnh</w:t>
+      </w:r>
+      <w:r>
+        <w:tab/>
+      </w:r>
+      <w:r>
+        <w:tab/>
+      </w:r>
+    </w:p>
+    <w:p>
+      <w:r>
+        <w:tab/>
+        <w:t>Yêu cầu:</w:t>
+      </w:r>
+      <w:r>
+        <w:tab/>
+      </w:r>
+    </w:p>
+    <w:p>
+      <w:r>
+        <w:tab/>
+        <w:t>Viết Dockerfile để chạy PostgreSQL (postgres:15).</w:t>
+      </w:r>
+      <w:r>
+        <w:tab/>
+      </w:r>
+    </w:p>
+    <w:p>
+      <w:r>
+        <w:tab/>
+        <w:t>Thêm file SQL để tự động tạo database khi container chạy lần đầu tiên.</w:t>
+      </w:r>
+      <w:r>
+        <w:tab/>
+      </w:r>
+    </w:p>
+    <w:p>
+      <w:r>
+        <w:tab/>
+      </w:r>
+      <w:r>
+        <w:tab/>
+      </w:r>
+    </w:p>
+    <w:p>
+      <w:r>
         <w:lastRenderedPageBreak/>
-        <w:tab/>
-        <w:t>Viết Dockerfile để build một ứng dụng Node.js với hai stage:</w:t>
-      </w:r>
-      <w:r>
-        <w:tab/>
-      </w:r>
-    </w:p>
-    <w:p>
-      <w:r>
-        <w:tab/>
-        <w:t>Stage 1: Dùng node:18 để build code.</w:t>
-      </w:r>
-      <w:r>
-        <w:tab/>
-      </w:r>
-    </w:p>
-    <w:p>
-      <w:r>
-        <w:tab/>
-        <w:t>Stage 2: Dùng node:18-alpine để chạy ứng dụng đã build.</w:t>
-      </w:r>
-      <w:r>
-        <w:tab/>
-      </w:r>
-    </w:p>
-    <w:p>
-      <w:r>
-        <w:tab/>
-      </w:r>
-      <w:r>
-        <w:tab/>
-      </w:r>
-    </w:p>
-    <w:p>
-      <w:r>
-        <w:t>Bài 7: Sử dụng biến môi trường trong Dockerfile</w:t>
+        <w:t>Bài 9: Tạo Dockerfile chạy Redis với cấu hình tùy chỉnh</w:t>
       </w:r>
       <w:r>
         <w:tab/>
@@ -1912,99 +2138,15 @@
     <w:p>
       <w:r>
         <w:tab/>
-        <w:t>Viết Dockerfile cho ứng dụng Python đọc biến môi trường APP_ENV và in ra màn hình.</w:t>
-      </w:r>
-      <w:r>
-        <w:tab/>
-      </w:r>
-    </w:p>
-    <w:p>
-      <w:r>
-        <w:tab/>
-        <w:t>Sử dụng ENV APP_ENV=development trong Dockerfile.</w:t>
-      </w:r>
-      <w:r>
-        <w:tab/>
-      </w:r>
-    </w:p>
-    <w:p>
-      <w:r>
-        <w:tab/>
-      </w:r>
-      <w:r>
-        <w:tab/>
-      </w:r>
-    </w:p>
-    <w:p>
-      <w:r>
-        <w:t>Bài 8: Tạo Dockerfile cho PostgreSQL tùy chỉnh</w:t>
-      </w:r>
-      <w:r>
-        <w:tab/>
-      </w:r>
-      <w:r>
-        <w:tab/>
-      </w:r>
-    </w:p>
-    <w:p>
-      <w:r>
-        <w:tab/>
-        <w:t>Yêu cầu:</w:t>
-      </w:r>
-      <w:r>
-        <w:tab/>
-      </w:r>
-    </w:p>
-    <w:p>
-      <w:r>
-        <w:tab/>
-        <w:t>Viết Dockerfile để chạy PostgreSQL (postgres:15).</w:t>
-      </w:r>
-      <w:r>
-        <w:tab/>
-      </w:r>
-    </w:p>
-    <w:p>
-      <w:r>
-        <w:tab/>
-        <w:t>Thêm file SQL để tự động tạo database khi container chạy lần đầu tiên.</w:t>
-      </w:r>
-      <w:r>
-        <w:tab/>
-      </w:r>
-    </w:p>
-    <w:p>
-      <w:r>
-        <w:tab/>
-      </w:r>
-      <w:r>
-        <w:tab/>
-      </w:r>
-    </w:p>
-    <w:p>
-      <w:r>
-        <w:t>Bài 9: Tạo Dockerfile chạy Redis với cấu hình tùy chỉnh</w:t>
-      </w:r>
-      <w:r>
-        <w:tab/>
-      </w:r>
-      <w:r>
-        <w:tab/>
-      </w:r>
-    </w:p>
-    <w:p>
-      <w:r>
-        <w:tab/>
-        <w:t>Yêu cầu:</w:t>
-      </w:r>
-      <w:r>
-        <w:tab/>
-      </w:r>
-    </w:p>
-    <w:p>
-      <w:r>
-        <w:tab/>
-        <w:t>Viết Dockerfile sử dụng redis:latest.</w:t>
+        <w:t xml:space="preserve">Viết Dockerfile sử dụng </w:t>
+      </w:r>
+      <w:proofErr w:type="gramStart"/>
+      <w:r>
+        <w:t>redis:latest</w:t>
+      </w:r>
+      <w:proofErr w:type="gramEnd"/>
+      <w:r>
+        <w:t>.</w:t>
       </w:r>
       <w:r>
         <w:tab/>
@@ -2772,6 +2914,7 @@
   <w:style w:type="character" w:default="1" w:styleId="DefaultParagraphFont">
     <w:name w:val="Default Paragraph Font"/>
     <w:uiPriority w:val="1"/>
+    <w:semiHidden/>
     <w:unhideWhenUsed/>
   </w:style>
   <w:style w:type="table" w:default="1" w:styleId="TableNormal">

</xml_diff>

<commit_message>
feat(ex03): create dockerfile in react
</commit_message>
<xml_diff>
--- a/22655541_TranNgocHuyen.docx
+++ b/22655541_TranNgocHuyen.docx
@@ -1421,15 +1421,7 @@
         </w:numPr>
       </w:pPr>
       <w:r>
-        <w:t xml:space="preserve">docker </w:t>
-      </w:r>
-      <w:proofErr w:type="gramStart"/>
-      <w:r>
-        <w:t>run -d --</w:t>
-      </w:r>
-      <w:proofErr w:type="gramEnd"/>
-      <w:r>
-        <w:t>network my_network --name my_container nginx</w:t>
+        <w:t>docker run -d --network my_network --name my_container nginx</w:t>
       </w:r>
     </w:p>
     <w:p>
@@ -1681,13 +1673,8 @@
         </w:numPr>
       </w:pPr>
       <w:r>
-        <w:t>docker build -t my_nginx_</w:t>
-      </w:r>
-      <w:proofErr w:type="gramStart"/>
-      <w:r>
-        <w:t>image .</w:t>
-      </w:r>
-      <w:proofErr w:type="gramEnd"/>
+        <w:t>docker build -t my_nginx_image .</w:t>
+      </w:r>
     </w:p>
     <w:p>
       <w:pPr>
@@ -1841,6 +1828,44 @@
     </w:p>
     <w:p>
       <w:r>
+        <w:lastRenderedPageBreak/>
+        <w:drawing>
+          <wp:inline distT="0" distB="0" distL="0" distR="0" wp14:anchorId="5A61AB1B" wp14:editId="120D7C77">
+            <wp:extent cx="5943600" cy="3342005"/>
+            <wp:effectExtent l="0" t="0" r="0" b="0"/>
+            <wp:docPr id="1649032578" name="Picture 1"/>
+            <wp:cNvGraphicFramePr>
+              <a:graphicFrameLocks xmlns:a="http://schemas.openxmlformats.org/drawingml/2006/main" noChangeAspect="1"/>
+            </wp:cNvGraphicFramePr>
+            <a:graphic xmlns:a="http://schemas.openxmlformats.org/drawingml/2006/main">
+              <a:graphicData uri="http://schemas.openxmlformats.org/drawingml/2006/picture">
+                <pic:pic xmlns:pic="http://schemas.openxmlformats.org/drawingml/2006/picture">
+                  <pic:nvPicPr>
+                    <pic:cNvPr id="1649032578" name=""/>
+                    <pic:cNvPicPr/>
+                  </pic:nvPicPr>
+                  <pic:blipFill>
+                    <a:blip r:embed="rId34"/>
+                    <a:stretch>
+                      <a:fillRect/>
+                    </a:stretch>
+                  </pic:blipFill>
+                  <pic:spPr>
+                    <a:xfrm>
+                      <a:off x="0" y="0"/>
+                      <a:ext cx="5943600" cy="3342005"/>
+                    </a:xfrm>
+                    <a:prstGeom prst="rect">
+                      <a:avLst/>
+                    </a:prstGeom>
+                  </pic:spPr>
+                </pic:pic>
+              </a:graphicData>
+            </a:graphic>
+          </wp:inline>
+        </w:drawing>
+      </w:r>
+      <w:r>
         <w:tab/>
       </w:r>
       <w:r>
@@ -1878,20 +1903,51 @@
     </w:p>
     <w:p>
       <w:r>
+        <w:tab/>
+        <w:t>Sử dụng node:18-alpine làm base image.</w:t>
+      </w:r>
+      <w:r>
+        <w:tab/>
+      </w:r>
+    </w:p>
+    <w:p>
+      <w:r>
         <w:lastRenderedPageBreak/>
-        <w:tab/>
-        <w:t>Sử dụng node:18-alpine làm base image.</w:t>
-      </w:r>
-      <w:r>
-        <w:tab/>
-      </w:r>
-    </w:p>
-    <w:p>
-      <w:r>
-        <w:tab/>
-      </w:r>
-      <w:r>
-        <w:tab/>
+        <w:drawing>
+          <wp:inline distT="0" distB="0" distL="0" distR="0" wp14:anchorId="67164003" wp14:editId="2AFCFF17">
+            <wp:extent cx="5943600" cy="3332480"/>
+            <wp:effectExtent l="0" t="0" r="0" b="1270"/>
+            <wp:docPr id="1472810479" name="Picture 1"/>
+            <wp:cNvGraphicFramePr>
+              <a:graphicFrameLocks xmlns:a="http://schemas.openxmlformats.org/drawingml/2006/main" noChangeAspect="1"/>
+            </wp:cNvGraphicFramePr>
+            <a:graphic xmlns:a="http://schemas.openxmlformats.org/drawingml/2006/main">
+              <a:graphicData uri="http://schemas.openxmlformats.org/drawingml/2006/picture">
+                <pic:pic xmlns:pic="http://schemas.openxmlformats.org/drawingml/2006/picture">
+                  <pic:nvPicPr>
+                    <pic:cNvPr id="1472810479" name=""/>
+                    <pic:cNvPicPr/>
+                  </pic:nvPicPr>
+                  <pic:blipFill>
+                    <a:blip r:embed="rId35"/>
+                    <a:stretch>
+                      <a:fillRect/>
+                    </a:stretch>
+                  </pic:blipFill>
+                  <pic:spPr>
+                    <a:xfrm>
+                      <a:off x="0" y="0"/>
+                      <a:ext cx="5943600" cy="3332480"/>
+                    </a:xfrm>
+                    <a:prstGeom prst="rect">
+                      <a:avLst/>
+                    </a:prstGeom>
+                  </pic:spPr>
+                </pic:pic>
+              </a:graphicData>
+            </a:graphic>
+          </wp:inline>
+        </w:drawing>
       </w:r>
     </w:p>
     <w:p>
@@ -1917,15 +1973,7 @@
     <w:p>
       <w:r>
         <w:tab/>
-        <w:t xml:space="preserve">Tạo một file index.html đơn giản và sử dụng </w:t>
-      </w:r>
-      <w:proofErr w:type="gramStart"/>
-      <w:r>
-        <w:t>nginx:latest</w:t>
-      </w:r>
-      <w:proofErr w:type="gramEnd"/>
-      <w:r>
-        <w:t xml:space="preserve"> để phục vụ trang web.</w:t>
+        <w:t>Tạo một file index.html đơn giản và sử dụng nginx:latest để phục vụ trang web.</w:t>
       </w:r>
       <w:r>
         <w:tab/>
@@ -2044,6 +2092,7 @@
     </w:p>
     <w:p>
       <w:r>
+        <w:lastRenderedPageBreak/>
         <w:tab/>
         <w:t>Viết Dockerfile cho ứng dụng Python đọc biến môi trường APP_ENV và in ra màn hình.</w:t>
       </w:r>
@@ -2116,7 +2165,6 @@
     </w:p>
     <w:p>
       <w:r>
-        <w:lastRenderedPageBreak/>
         <w:t>Bài 9: Tạo Dockerfile chạy Redis với cấu hình tùy chỉnh</w:t>
       </w:r>
       <w:r>
@@ -2138,15 +2186,7 @@
     <w:p>
       <w:r>
         <w:tab/>
-        <w:t xml:space="preserve">Viết Dockerfile sử dụng </w:t>
-      </w:r>
-      <w:proofErr w:type="gramStart"/>
-      <w:r>
-        <w:t>redis:latest</w:t>
-      </w:r>
-      <w:proofErr w:type="gramEnd"/>
-      <w:r>
-        <w:t>.</w:t>
+        <w:t>Viết Dockerfile sử dụng redis:latest.</w:t>
       </w:r>
       <w:r>
         <w:tab/>

</xml_diff>